<commit_message>
sync(workvault): 2026-10-23 13:37 差分 4 件
</commit_message>
<xml_diff>
--- a/workvault-sync/07-1_棚卸/手順と設計/固定テーブル棚卸し作業手順書_2026-10-23.docx
+++ b/workvault-sync/07-1_棚卸/手順と設計/固定テーブル棚卸し作業手順書_2026-10-23.docx
@@ -1565,7 +1565,7 @@
           <w:sz w:val="21"/>
           <w:rFonts w:ascii="Yu Gothic" w:hAnsi="Yu Gothic" w:eastAsia="游ゴシック"/>
         </w:rPr>
-        <w:t>① Job読込の後、約10分待つ。EG-Proへの反映待ちの時間。</w:t>
+        <w:t>① Job読込の後、15分ほど待つ。反映に時間がかかる場合がある（マクロ・データ関係性マップでは約10分の記載もある）。</w:t>
       </w:r>
     </w:p>
     <w:p>
@@ -1579,7 +1579,7 @@
           <w:sz w:val="21"/>
           <w:rFonts w:ascii="Yu Gothic" w:hAnsi="Yu Gothic" w:eastAsia="游ゴシック"/>
         </w:rPr>
-        <w:t>② eplantview で「材料照合」→「現在のセットアップレポート」を選択する。</w:t>
+        <w:t>② eplantview（PanaCIMのサーバー）で「材料照合」→「現在のセットアップレポート」を選択する。</w:t>
       </w:r>
     </w:p>
     <w:p>
@@ -1593,7 +1593,7 @@
           <w:sz w:val="21"/>
           <w:rFonts w:ascii="Yu Gothic" w:hAnsi="Yu Gothic" w:eastAsia="游ゴシック"/>
         </w:rPr>
-        <w:t>③ 設備選択で「全設備」→OK→適用→保存の順に進める。</w:t>
+        <w:t>③ 設備選択を押し、対象のシリアル番号を選択してから「全設備」→OK→適用の順に進める。</w:t>
       </w:r>
     </w:p>
     <w:p>
@@ -1607,7 +1607,7 @@
           <w:sz w:val="21"/>
           <w:rFonts w:ascii="Yu Gothic" w:hAnsi="Yu Gothic" w:eastAsia="游ゴシック"/>
         </w:rPr>
-        <w:t>④ 保存したファイルは Shift-JIS で出る。このファイルを Step4 のマクロに読み込ませる。</w:t>
+        <w:t>④ レポートファイルを保存し、Step4 のマクロに読み込ませる。文字コードの変換（UTF-8→Shift-JIS）はマクロ側の取込で自動に行われる。</w:t>
       </w:r>
     </w:p>
     <w:p>
@@ -1792,7 +1792,7 @@
           <w:sz w:val="21"/>
           <w:rFonts w:ascii="Yu Gothic" w:hAnsi="Yu Gothic" w:eastAsia="游ゴシック"/>
         </w:rPr>
-        <w:t>① SQL Server Management Studio で EG-Pro のデータベースに接続する。</w:t>
+        <w:t>① 方法2は方法1が使えない場合に実施する。使うPCはサーバーラックの一番左（実サーバー）。</w:t>
       </w:r>
     </w:p>
     <w:p>
@@ -1806,7 +1806,7 @@
           <w:sz w:val="21"/>
           <w:rFonts w:ascii="Yu Gothic" w:hAnsi="Yu Gothic" w:eastAsia="游ゴシック"/>
         </w:rPr>
-        <w:t>② 「在庫データ取得.txt」のクエリを貼り付けて実行する。</w:t>
+        <w:t>② SQL Server Management Studio で EG-Pro のデータベースに接続する。</w:t>
       </w:r>
     </w:p>
     <w:p>
@@ -1820,7 +1820,21 @@
           <w:sz w:val="21"/>
           <w:rFonts w:ascii="Yu Gothic" w:hAnsi="Yu Gothic" w:eastAsia="游ゴシック"/>
         </w:rPr>
-        <w:t>③ 実行結果を保存する。</w:t>
+        <w:t>③ 「在庫データ取得.txt」をダブルクリックで開き、クエリを貼り付けて実行する。このファイルはデスクトップにも設置されている。</w:t>
+      </w:r>
+    </w:p>
+    <w:p>
+      <w:pPr>
+        <w:spacing w:before="0" w:after="40"/>
+        <w:ind w:left="227"/>
+      </w:pPr>
+      <w:r>
+        <w:rPr>
+          <w:b w:val="0"/>
+          <w:sz w:val="21"/>
+          <w:rFonts w:ascii="Yu Gothic" w:hAnsi="Yu Gothic" w:eastAsia="游ゴシック"/>
+        </w:rPr>
+        <w:t>④ 実行結果を保存する。</w:t>
       </w:r>
     </w:p>
     <w:p>

</xml_diff>